<commit_message>
CORREGIDA LA CAGADA de no poner que node no front
</commit_message>
<xml_diff>
--- a/DOCUMENTACION_BTT.docx
+++ b/DOCUMENTACION_BTT.docx
@@ -4013,7 +4013,7 @@
           <w14:ligatures w14:val="standardContextual"/>
         </w:rPr>
         <w:drawing>
-          <wp:inline distT="0" distB="0" distL="0" distR="0" wp14:anchorId="14CC220F" wp14:editId="3C4C1EB4">
+          <wp:inline distT="0" distB="0" distL="0" distR="0" wp14:anchorId="14CC220F" wp14:editId="67D4090B">
             <wp:extent cx="5495925" cy="5177414"/>
             <wp:effectExtent l="0" t="0" r="0" b="4445"/>
             <wp:docPr id="443977163" name="Imagen 2"/>
@@ -7040,7 +7040,7 @@
           <w14:ligatures w14:val="standardContextual"/>
         </w:rPr>
         <w:drawing>
-          <wp:inline distT="0" distB="0" distL="0" distR="0" wp14:anchorId="7083AF08" wp14:editId="51657526">
+          <wp:inline distT="0" distB="0" distL="0" distR="0" wp14:anchorId="7083AF08" wp14:editId="2D3866FF">
             <wp:extent cx="5624423" cy="6248466"/>
             <wp:effectExtent l="0" t="0" r="0" b="0"/>
             <wp:docPr id="473122548" name="Imagen 4"/>
@@ -13638,7 +13638,7 @@
       <w:tblGrid>
         <w:gridCol w:w="2108"/>
         <w:gridCol w:w="880"/>
-        <w:gridCol w:w="3828"/>
+        <w:gridCol w:w="6168"/>
       </w:tblGrid>
       <w:tr>
         <w:trPr>
@@ -13789,14 +13789,45 @@
           <w:p>
             <w:pPr>
               <w:rPr>
-                <w:lang w:val="pt-PT"/>
-              </w:rPr>
-            </w:pPr>
-            <w:r>
-              <w:rPr>
-                <w:lang w:val="pt-PT"/>
+                <w:lang w:val="es-ES"/>
+              </w:rPr>
+            </w:pPr>
+            <w:r>
+              <w:rPr>
+                <w:lang w:val="es-ES"/>
               </w:rPr>
               <w:t>Entorno de ejecución</w:t>
+            </w:r>
+            <w:r>
+              <w:rPr>
+                <w:lang w:val="es-ES"/>
+              </w:rPr>
+              <w:t>(NO ES FRONT PERO ES NECESARIA</w:t>
+            </w:r>
+          </w:p>
+          <w:p>
+            <w:pPr>
+              <w:rPr>
+                <w:lang w:val="es-ES"/>
+              </w:rPr>
+            </w:pPr>
+            <w:r>
+              <w:rPr>
+                <w:lang w:val="es-ES"/>
+              </w:rPr>
+              <w:t>PARA CORRER VITE</w:t>
+            </w:r>
+            <w:r>
+              <w:rPr>
+                <w:lang w:val="es-ES"/>
+              </w:rPr>
+              <w:t xml:space="preserve"> </w:t>
+            </w:r>
+            <w:r>
+              <w:rPr>
+                <w:lang w:val="es-ES"/>
+              </w:rPr>
+              <w:t>Y REACT)</w:t>
             </w:r>
           </w:p>
         </w:tc>

</xml_diff>